<commit_message>
docs: nome da clinica na planilha e metadados dos documentos gerados
A planilha de custos passa a trazer "Jaqueline Aranha Estetica" no titulo e nas propriedades
do arquivo, e sai sem o caminho da pasta local que o Excel grava ao salvar. Os DOCX/PDF
gerados ganham titulo, assunto e autor nas propriedades (antes: autor "python-docx").

Co-Authored-By: Claude Opus 5.5 <noreply@anthropic.com>
</commit_message>
<xml_diff>
--- a/docs/tcc/JaquelineAranhaEstetica-Regras-de-Negocio.docx
+++ b/docs/tcc/JaquelineAranhaEstetica-Regras-de-Negocio.docx
@@ -105,7 +105,7 @@
       <w:r>
         <w:fldChar w:fldCharType="separate"/>
       </w:r>
-      <w:hyperlink w:anchor="_Toc244286987" w:history="1">
+      <w:hyperlink w:anchor="_Toc244287865" w:history="1">
         <w:r>
           <w:rPr>
             <w:rStyle w:val="Hyperlink"/>
@@ -132,7 +132,7 @@
             <w:noProof/>
             <w:webHidden/>
           </w:rPr>
-          <w:instrText xml:space="preserve"> PAGEREF _Toc244286987 \h </w:instrText>
+          <w:instrText xml:space="preserve"> PAGEREF _Toc244287865 \h </w:instrText>
         </w:r>
         <w:r>
           <w:rPr>
@@ -173,7 +173,7 @@
           <w:noProof/>
         </w:rPr>
       </w:pPr>
-      <w:hyperlink w:anchor="_Toc244286988" w:history="1">
+      <w:hyperlink w:anchor="_Toc244287866" w:history="1">
         <w:r>
           <w:rPr>
             <w:rStyle w:val="Hyperlink"/>
@@ -200,7 +200,7 @@
             <w:noProof/>
             <w:webHidden/>
           </w:rPr>
-          <w:instrText xml:space="preserve"> PAGEREF _Toc244286988 \h </w:instrText>
+          <w:instrText xml:space="preserve"> PAGEREF _Toc244287866 \h </w:instrText>
         </w:r>
         <w:r>
           <w:rPr>
@@ -241,7 +241,7 @@
           <w:noProof/>
         </w:rPr>
       </w:pPr>
-      <w:hyperlink w:anchor="_Toc244286989" w:history="1">
+      <w:hyperlink w:anchor="_Toc244287867" w:history="1">
         <w:r>
           <w:rPr>
             <w:rStyle w:val="Hyperlink"/>
@@ -268,7 +268,7 @@
             <w:noProof/>
             <w:webHidden/>
           </w:rPr>
-          <w:instrText xml:space="preserve"> PAGEREF _Toc244286989 \h </w:instrText>
+          <w:instrText xml:space="preserve"> PAGEREF _Toc244287867 \h </w:instrText>
         </w:r>
         <w:r>
           <w:rPr>
@@ -309,7 +309,7 @@
           <w:noProof/>
         </w:rPr>
       </w:pPr>
-      <w:hyperlink w:anchor="_Toc244286990" w:history="1">
+      <w:hyperlink w:anchor="_Toc244287868" w:history="1">
         <w:r>
           <w:rPr>
             <w:rStyle w:val="Hyperlink"/>
@@ -336,7 +336,7 @@
             <w:noProof/>
             <w:webHidden/>
           </w:rPr>
-          <w:instrText xml:space="preserve"> PAGEREF _Toc244286990 \h </w:instrText>
+          <w:instrText xml:space="preserve"> PAGEREF _Toc244287868 \h </w:instrText>
         </w:r>
         <w:r>
           <w:rPr>
@@ -377,7 +377,7 @@
           <w:noProof/>
         </w:rPr>
       </w:pPr>
-      <w:hyperlink w:anchor="_Toc244286991" w:history="1">
+      <w:hyperlink w:anchor="_Toc244287869" w:history="1">
         <w:r>
           <w:rPr>
             <w:rStyle w:val="Hyperlink"/>
@@ -404,7 +404,7 @@
             <w:noProof/>
             <w:webHidden/>
           </w:rPr>
-          <w:instrText xml:space="preserve"> PAGEREF _Toc244286991 \h </w:instrText>
+          <w:instrText xml:space="preserve"> PAGEREF _Toc244287869 \h </w:instrText>
         </w:r>
         <w:r>
           <w:rPr>
@@ -445,7 +445,7 @@
           <w:noProof/>
         </w:rPr>
       </w:pPr>
-      <w:hyperlink w:anchor="_Toc244286992" w:history="1">
+      <w:hyperlink w:anchor="_Toc244287870" w:history="1">
         <w:r>
           <w:rPr>
             <w:rStyle w:val="Hyperlink"/>
@@ -472,7 +472,7 @@
             <w:noProof/>
             <w:webHidden/>
           </w:rPr>
-          <w:instrText xml:space="preserve"> PAGEREF _Toc244286992 \h </w:instrText>
+          <w:instrText xml:space="preserve"> PAGEREF _Toc244287870 \h </w:instrText>
         </w:r>
         <w:r>
           <w:rPr>
@@ -513,7 +513,7 @@
           <w:noProof/>
         </w:rPr>
       </w:pPr>
-      <w:hyperlink w:anchor="_Toc244286993" w:history="1">
+      <w:hyperlink w:anchor="_Toc244287871" w:history="1">
         <w:r>
           <w:rPr>
             <w:rStyle w:val="Hyperlink"/>
@@ -540,7 +540,7 @@
             <w:noProof/>
             <w:webHidden/>
           </w:rPr>
-          <w:instrText xml:space="preserve"> PAGEREF _Toc244286993 \h </w:instrText>
+          <w:instrText xml:space="preserve"> PAGEREF _Toc244287871 \h </w:instrText>
         </w:r>
         <w:r>
           <w:rPr>
@@ -581,7 +581,7 @@
           <w:noProof/>
         </w:rPr>
       </w:pPr>
-      <w:hyperlink w:anchor="_Toc244286994" w:history="1">
+      <w:hyperlink w:anchor="_Toc244287872" w:history="1">
         <w:r>
           <w:rPr>
             <w:rStyle w:val="Hyperlink"/>
@@ -608,7 +608,7 @@
             <w:noProof/>
             <w:webHidden/>
           </w:rPr>
-          <w:instrText xml:space="preserve"> PAGEREF _Toc244286994 \h </w:instrText>
+          <w:instrText xml:space="preserve"> PAGEREF _Toc244287872 \h </w:instrText>
         </w:r>
         <w:r>
           <w:rPr>
@@ -649,7 +649,7 @@
           <w:noProof/>
         </w:rPr>
       </w:pPr>
-      <w:hyperlink w:anchor="_Toc244286995" w:history="1">
+      <w:hyperlink w:anchor="_Toc244287873" w:history="1">
         <w:r>
           <w:rPr>
             <w:rStyle w:val="Hyperlink"/>
@@ -676,7 +676,7 @@
             <w:noProof/>
             <w:webHidden/>
           </w:rPr>
-          <w:instrText xml:space="preserve"> PAGEREF _Toc244286995 \h </w:instrText>
+          <w:instrText xml:space="preserve"> PAGEREF _Toc244287873 \h </w:instrText>
         </w:r>
         <w:r>
           <w:rPr>
@@ -717,7 +717,7 @@
           <w:noProof/>
         </w:rPr>
       </w:pPr>
-      <w:hyperlink w:anchor="_Toc244286996" w:history="1">
+      <w:hyperlink w:anchor="_Toc244287874" w:history="1">
         <w:r>
           <w:rPr>
             <w:rStyle w:val="Hyperlink"/>
@@ -744,7 +744,7 @@
             <w:noProof/>
             <w:webHidden/>
           </w:rPr>
-          <w:instrText xml:space="preserve"> PAGEREF _Toc244286996 \h </w:instrText>
+          <w:instrText xml:space="preserve"> PAGEREF _Toc244287874 \h </w:instrText>
         </w:r>
         <w:r>
           <w:rPr>
@@ -785,7 +785,7 @@
           <w:noProof/>
         </w:rPr>
       </w:pPr>
-      <w:hyperlink w:anchor="_Toc244286997" w:history="1">
+      <w:hyperlink w:anchor="_Toc244287875" w:history="1">
         <w:r>
           <w:rPr>
             <w:rStyle w:val="Hyperlink"/>
@@ -812,7 +812,7 @@
             <w:noProof/>
             <w:webHidden/>
           </w:rPr>
-          <w:instrText xml:space="preserve"> PAGEREF _Toc244286997 \h </w:instrText>
+          <w:instrText xml:space="preserve"> PAGEREF _Toc244287875 \h </w:instrText>
         </w:r>
         <w:r>
           <w:rPr>
@@ -853,7 +853,7 @@
           <w:noProof/>
         </w:rPr>
       </w:pPr>
-      <w:hyperlink w:anchor="_Toc244286998" w:history="1">
+      <w:hyperlink w:anchor="_Toc244287876" w:history="1">
         <w:r>
           <w:rPr>
             <w:rStyle w:val="Hyperlink"/>
@@ -880,7 +880,7 @@
             <w:noProof/>
             <w:webHidden/>
           </w:rPr>
-          <w:instrText xml:space="preserve"> PAGEREF _Toc244286998 \h </w:instrText>
+          <w:instrText xml:space="preserve"> PAGEREF _Toc244287876 \h </w:instrText>
         </w:r>
         <w:r>
           <w:rPr>
@@ -921,7 +921,7 @@
           <w:noProof/>
         </w:rPr>
       </w:pPr>
-      <w:hyperlink w:anchor="_Toc244286999" w:history="1">
+      <w:hyperlink w:anchor="_Toc244287877" w:history="1">
         <w:r>
           <w:rPr>
             <w:rStyle w:val="Hyperlink"/>
@@ -948,7 +948,7 @@
             <w:noProof/>
             <w:webHidden/>
           </w:rPr>
-          <w:instrText xml:space="preserve"> PAGEREF _Toc244286999 \h </w:instrText>
+          <w:instrText xml:space="preserve"> PAGEREF _Toc244287877 \h </w:instrText>
         </w:r>
         <w:r>
           <w:rPr>
@@ -989,7 +989,7 @@
           <w:noProof/>
         </w:rPr>
       </w:pPr>
-      <w:hyperlink w:anchor="_Toc244287000" w:history="1">
+      <w:hyperlink w:anchor="_Toc244287878" w:history="1">
         <w:r>
           <w:rPr>
             <w:rStyle w:val="Hyperlink"/>
@@ -1016,7 +1016,7 @@
             <w:noProof/>
             <w:webHidden/>
           </w:rPr>
-          <w:instrText xml:space="preserve"> PAGEREF _Toc244287000 \h </w:instrText>
+          <w:instrText xml:space="preserve"> PAGEREF _Toc244287878 \h </w:instrText>
         </w:r>
         <w:r>
           <w:rPr>
@@ -1057,7 +1057,7 @@
           <w:noProof/>
         </w:rPr>
       </w:pPr>
-      <w:hyperlink w:anchor="_Toc244287001" w:history="1">
+      <w:hyperlink w:anchor="_Toc244287879" w:history="1">
         <w:r>
           <w:rPr>
             <w:rStyle w:val="Hyperlink"/>
@@ -1084,7 +1084,7 @@
             <w:noProof/>
             <w:webHidden/>
           </w:rPr>
-          <w:instrText xml:space="preserve"> PAGEREF _Toc244287001 \h </w:instrText>
+          <w:instrText xml:space="preserve"> PAGEREF _Toc244287879 \h </w:instrText>
         </w:r>
         <w:r>
           <w:rPr>
@@ -1125,7 +1125,7 @@
           <w:noProof/>
         </w:rPr>
       </w:pPr>
-      <w:hyperlink w:anchor="_Toc244287002" w:history="1">
+      <w:hyperlink w:anchor="_Toc244287880" w:history="1">
         <w:r>
           <w:rPr>
             <w:rStyle w:val="Hyperlink"/>
@@ -1152,7 +1152,7 @@
             <w:noProof/>
             <w:webHidden/>
           </w:rPr>
-          <w:instrText xml:space="preserve"> PAGEREF _Toc244287002 \h </w:instrText>
+          <w:instrText xml:space="preserve"> PAGEREF _Toc244287880 \h </w:instrText>
         </w:r>
         <w:r>
           <w:rPr>
@@ -1193,7 +1193,7 @@
           <w:noProof/>
         </w:rPr>
       </w:pPr>
-      <w:hyperlink w:anchor="_Toc244287003" w:history="1">
+      <w:hyperlink w:anchor="_Toc244287881" w:history="1">
         <w:r>
           <w:rPr>
             <w:rStyle w:val="Hyperlink"/>
@@ -1220,7 +1220,7 @@
             <w:noProof/>
             <w:webHidden/>
           </w:rPr>
-          <w:instrText xml:space="preserve"> PAGEREF _Toc244287003 \h </w:instrText>
+          <w:instrText xml:space="preserve"> PAGEREF _Toc244287881 \h </w:instrText>
         </w:r>
         <w:r>
           <w:rPr>
@@ -1261,7 +1261,7 @@
           <w:noProof/>
         </w:rPr>
       </w:pPr>
-      <w:hyperlink w:anchor="_Toc244287004" w:history="1">
+      <w:hyperlink w:anchor="_Toc244287882" w:history="1">
         <w:r>
           <w:rPr>
             <w:rStyle w:val="Hyperlink"/>
@@ -1288,7 +1288,7 @@
             <w:noProof/>
             <w:webHidden/>
           </w:rPr>
-          <w:instrText xml:space="preserve"> PAGEREF _Toc244287004 \h </w:instrText>
+          <w:instrText xml:space="preserve"> PAGEREF _Toc244287882 \h </w:instrText>
         </w:r>
         <w:r>
           <w:rPr>
@@ -1329,7 +1329,7 @@
           <w:noProof/>
         </w:rPr>
       </w:pPr>
-      <w:hyperlink w:anchor="_Toc244287005" w:history="1">
+      <w:hyperlink w:anchor="_Toc244287883" w:history="1">
         <w:r>
           <w:rPr>
             <w:rStyle w:val="Hyperlink"/>
@@ -1356,7 +1356,7 @@
             <w:noProof/>
             <w:webHidden/>
           </w:rPr>
-          <w:instrText xml:space="preserve"> PAGEREF _Toc244287005 \h </w:instrText>
+          <w:instrText xml:space="preserve"> PAGEREF _Toc244287883 \h </w:instrText>
         </w:r>
         <w:r>
           <w:rPr>
@@ -1397,7 +1397,7 @@
           <w:noProof/>
         </w:rPr>
       </w:pPr>
-      <w:hyperlink w:anchor="_Toc244287006" w:history="1">
+      <w:hyperlink w:anchor="_Toc244287884" w:history="1">
         <w:r>
           <w:rPr>
             <w:rStyle w:val="Hyperlink"/>
@@ -1424,7 +1424,7 @@
             <w:noProof/>
             <w:webHidden/>
           </w:rPr>
-          <w:instrText xml:space="preserve"> PAGEREF _Toc244287006 \h </w:instrText>
+          <w:instrText xml:space="preserve"> PAGEREF _Toc244287884 \h </w:instrText>
         </w:r>
         <w:r>
           <w:rPr>
@@ -1465,7 +1465,7 @@
           <w:noProof/>
         </w:rPr>
       </w:pPr>
-      <w:hyperlink w:anchor="_Toc244287007" w:history="1">
+      <w:hyperlink w:anchor="_Toc244287885" w:history="1">
         <w:r>
           <w:rPr>
             <w:rStyle w:val="Hyperlink"/>
@@ -1492,7 +1492,7 @@
             <w:noProof/>
             <w:webHidden/>
           </w:rPr>
-          <w:instrText xml:space="preserve"> PAGEREF _Toc244287007 \h </w:instrText>
+          <w:instrText xml:space="preserve"> PAGEREF _Toc244287885 \h </w:instrText>
         </w:r>
         <w:r>
           <w:rPr>
@@ -1533,7 +1533,7 @@
           <w:noProof/>
         </w:rPr>
       </w:pPr>
-      <w:hyperlink w:anchor="_Toc244287008" w:history="1">
+      <w:hyperlink w:anchor="_Toc244287886" w:history="1">
         <w:r>
           <w:rPr>
             <w:rStyle w:val="Hyperlink"/>
@@ -1560,7 +1560,7 @@
             <w:noProof/>
             <w:webHidden/>
           </w:rPr>
-          <w:instrText xml:space="preserve"> PAGEREF _Toc244287008 \h </w:instrText>
+          <w:instrText xml:space="preserve"> PAGEREF _Toc244287886 \h </w:instrText>
         </w:r>
         <w:r>
           <w:rPr>
@@ -1601,7 +1601,7 @@
           <w:noProof/>
         </w:rPr>
       </w:pPr>
-      <w:hyperlink w:anchor="_Toc244287009" w:history="1">
+      <w:hyperlink w:anchor="_Toc244287887" w:history="1">
         <w:r>
           <w:rPr>
             <w:rStyle w:val="Hyperlink"/>
@@ -1628,7 +1628,7 @@
             <w:noProof/>
             <w:webHidden/>
           </w:rPr>
-          <w:instrText xml:space="preserve"> PAGEREF _Toc244287009 \h </w:instrText>
+          <w:instrText xml:space="preserve"> PAGEREF _Toc244287887 \h </w:instrText>
         </w:r>
         <w:r>
           <w:rPr>
@@ -1669,7 +1669,7 @@
           <w:noProof/>
         </w:rPr>
       </w:pPr>
-      <w:hyperlink w:anchor="_Toc244287010" w:history="1">
+      <w:hyperlink w:anchor="_Toc244287888" w:history="1">
         <w:r>
           <w:rPr>
             <w:rStyle w:val="Hyperlink"/>
@@ -1696,7 +1696,7 @@
             <w:noProof/>
             <w:webHidden/>
           </w:rPr>
-          <w:instrText xml:space="preserve"> PAGEREF _Toc244287010 \h </w:instrText>
+          <w:instrText xml:space="preserve"> PAGEREF _Toc244287888 \h </w:instrText>
         </w:r>
         <w:r>
           <w:rPr>
@@ -1737,7 +1737,7 @@
           <w:noProof/>
         </w:rPr>
       </w:pPr>
-      <w:hyperlink w:anchor="_Toc244287011" w:history="1">
+      <w:hyperlink w:anchor="_Toc244287889" w:history="1">
         <w:r>
           <w:rPr>
             <w:rStyle w:val="Hyperlink"/>
@@ -1764,7 +1764,7 @@
             <w:noProof/>
             <w:webHidden/>
           </w:rPr>
-          <w:instrText xml:space="preserve"> PAGEREF _Toc244287011 \h </w:instrText>
+          <w:instrText xml:space="preserve"> PAGEREF _Toc244287889 \h </w:instrText>
         </w:r>
         <w:r>
           <w:rPr>
@@ -1805,7 +1805,7 @@
           <w:noProof/>
         </w:rPr>
       </w:pPr>
-      <w:hyperlink w:anchor="_Toc244287012" w:history="1">
+      <w:hyperlink w:anchor="_Toc244287890" w:history="1">
         <w:r>
           <w:rPr>
             <w:rStyle w:val="Hyperlink"/>
@@ -1832,7 +1832,7 @@
             <w:noProof/>
             <w:webHidden/>
           </w:rPr>
-          <w:instrText xml:space="preserve"> PAGEREF _Toc244287012 \h </w:instrText>
+          <w:instrText xml:space="preserve"> PAGEREF _Toc244287890 \h </w:instrText>
         </w:r>
         <w:r>
           <w:rPr>
@@ -1873,7 +1873,7 @@
           <w:noProof/>
         </w:rPr>
       </w:pPr>
-      <w:hyperlink w:anchor="_Toc244287013" w:history="1">
+      <w:hyperlink w:anchor="_Toc244287891" w:history="1">
         <w:r>
           <w:rPr>
             <w:rStyle w:val="Hyperlink"/>
@@ -1900,7 +1900,7 @@
             <w:noProof/>
             <w:webHidden/>
           </w:rPr>
-          <w:instrText xml:space="preserve"> PAGEREF _Toc244287013 \h </w:instrText>
+          <w:instrText xml:space="preserve"> PAGEREF _Toc244287891 \h </w:instrText>
         </w:r>
         <w:r>
           <w:rPr>
@@ -1941,7 +1941,7 @@
           <w:noProof/>
         </w:rPr>
       </w:pPr>
-      <w:hyperlink w:anchor="_Toc244287014" w:history="1">
+      <w:hyperlink w:anchor="_Toc244287892" w:history="1">
         <w:r>
           <w:rPr>
             <w:rStyle w:val="Hyperlink"/>
@@ -1968,7 +1968,7 @@
             <w:noProof/>
             <w:webHidden/>
           </w:rPr>
-          <w:instrText xml:space="preserve"> PAGEREF _Toc244287014 \h </w:instrText>
+          <w:instrText xml:space="preserve"> PAGEREF _Toc244287892 \h </w:instrText>
         </w:r>
         <w:r>
           <w:rPr>
@@ -2009,7 +2009,7 @@
           <w:noProof/>
         </w:rPr>
       </w:pPr>
-      <w:hyperlink w:anchor="_Toc244287015" w:history="1">
+      <w:hyperlink w:anchor="_Toc244287893" w:history="1">
         <w:r>
           <w:rPr>
             <w:rStyle w:val="Hyperlink"/>
@@ -2036,7 +2036,7 @@
             <w:noProof/>
             <w:webHidden/>
           </w:rPr>
-          <w:instrText xml:space="preserve"> PAGEREF _Toc244287015 \h </w:instrText>
+          <w:instrText xml:space="preserve"> PAGEREF _Toc244287893 \h </w:instrText>
         </w:r>
         <w:r>
           <w:rPr>
@@ -2077,7 +2077,7 @@
           <w:noProof/>
         </w:rPr>
       </w:pPr>
-      <w:hyperlink w:anchor="_Toc244287016" w:history="1">
+      <w:hyperlink w:anchor="_Toc244287894" w:history="1">
         <w:r>
           <w:rPr>
             <w:rStyle w:val="Hyperlink"/>
@@ -2104,7 +2104,7 @@
             <w:noProof/>
             <w:webHidden/>
           </w:rPr>
-          <w:instrText xml:space="preserve"> PAGEREF _Toc244287016 \h </w:instrText>
+          <w:instrText xml:space="preserve"> PAGEREF _Toc244287894 \h </w:instrText>
         </w:r>
         <w:r>
           <w:rPr>
@@ -2145,7 +2145,7 @@
           <w:noProof/>
         </w:rPr>
       </w:pPr>
-      <w:hyperlink w:anchor="_Toc244287017" w:history="1">
+      <w:hyperlink w:anchor="_Toc244287895" w:history="1">
         <w:r>
           <w:rPr>
             <w:rStyle w:val="Hyperlink"/>
@@ -2172,7 +2172,7 @@
             <w:noProof/>
             <w:webHidden/>
           </w:rPr>
-          <w:instrText xml:space="preserve"> PAGEREF _Toc244287017 \h </w:instrText>
+          <w:instrText xml:space="preserve"> PAGEREF _Toc244287895 \h </w:instrText>
         </w:r>
         <w:r>
           <w:rPr>
@@ -2213,7 +2213,7 @@
           <w:noProof/>
         </w:rPr>
       </w:pPr>
-      <w:hyperlink w:anchor="_Toc244287018" w:history="1">
+      <w:hyperlink w:anchor="_Toc244287896" w:history="1">
         <w:r>
           <w:rPr>
             <w:rStyle w:val="Hyperlink"/>
@@ -2240,7 +2240,7 @@
             <w:noProof/>
             <w:webHidden/>
           </w:rPr>
-          <w:instrText xml:space="preserve"> PAGEREF _Toc244287018 \h </w:instrText>
+          <w:instrText xml:space="preserve"> PAGEREF _Toc244287896 \h </w:instrText>
         </w:r>
         <w:r>
           <w:rPr>
@@ -2285,7 +2285,7 @@
       <w:pPr>
         <w:pStyle w:val="Ttulo1"/>
       </w:pPr>
-      <w:bookmarkStart w:id="0" w:name="_Toc244286987"/>
+      <w:bookmarkStart w:id="0" w:name="_Toc244287865"/>
       <w:r>
         <w:lastRenderedPageBreak/>
         <w:t>1. Introdução</w:t>
@@ -2296,7 +2296,7 @@
       <w:pPr>
         <w:pStyle w:val="Ttulo2"/>
       </w:pPr>
-      <w:bookmarkStart w:id="1" w:name="_Toc244286988"/>
+      <w:bookmarkStart w:id="1" w:name="_Toc244287866"/>
       <w:r>
         <w:t>1.1 Objetivo</w:t>
       </w:r>
@@ -2311,7 +2311,7 @@
       <w:pPr>
         <w:pStyle w:val="Ttulo2"/>
       </w:pPr>
-      <w:bookmarkStart w:id="2" w:name="_Toc244286989"/>
+      <w:bookmarkStart w:id="2" w:name="_Toc244287867"/>
       <w:r>
         <w:t>1.2 Como ler</w:t>
       </w:r>
@@ -2406,7 +2406,7 @@
       <w:pPr>
         <w:pStyle w:val="Ttulo2"/>
       </w:pPr>
-      <w:bookmarkStart w:id="3" w:name="_Toc244286990"/>
+      <w:bookmarkStart w:id="3" w:name="_Toc244287868"/>
       <w:r>
         <w:t>1.3 Princípios</w:t>
       </w:r>
@@ -2493,7 +2493,7 @@
       <w:pPr>
         <w:pStyle w:val="Ttulo1"/>
       </w:pPr>
-      <w:bookmarkStart w:id="4" w:name="_Toc244286991"/>
+      <w:bookmarkStart w:id="4" w:name="_Toc244287869"/>
       <w:r>
         <w:t>2. Catálogo das regras de negócio</w:t>
       </w:r>
@@ -6577,7 +6577,7 @@
       <w:pPr>
         <w:pStyle w:val="Ttulo1"/>
       </w:pPr>
-      <w:bookmarkStart w:id="5" w:name="_Toc244286992"/>
+      <w:bookmarkStart w:id="5" w:name="_Toc244287870"/>
       <w:r>
         <w:t>3. Especificação detalhada por área</w:t>
       </w:r>
@@ -6587,7 +6587,7 @@
       <w:pPr>
         <w:pStyle w:val="Ttulo2"/>
       </w:pPr>
-      <w:bookmarkStart w:id="6" w:name="_Toc244286993"/>
+      <w:bookmarkStart w:id="6" w:name="_Toc244287871"/>
       <w:r>
         <w:t>3.1 Atores e papéis</w:t>
       </w:r>
@@ -6757,7 +6757,7 @@
       <w:pPr>
         <w:pStyle w:val="Ttulo2"/>
       </w:pPr>
-      <w:bookmarkStart w:id="7" w:name="_Toc244286994"/>
+      <w:bookmarkStart w:id="7" w:name="_Toc244287872"/>
       <w:r>
         <w:t>3.2 Cliente</w:t>
       </w:r>
@@ -7021,7 +7021,7 @@
       <w:pPr>
         <w:pStyle w:val="Ttulo2"/>
       </w:pPr>
-      <w:bookmarkStart w:id="8" w:name="_Toc244286995"/>
+      <w:bookmarkStart w:id="8" w:name="_Toc244287873"/>
       <w:r>
         <w:t>3.3 Agendamento público (wizard)</w:t>
       </w:r>
@@ -7780,7 +7780,7 @@
       <w:pPr>
         <w:pStyle w:val="Ttulo2"/>
       </w:pPr>
-      <w:bookmarkStart w:id="9" w:name="_Toc244286996"/>
+      <w:bookmarkStart w:id="9" w:name="_Toc244287874"/>
       <w:r>
         <w:t>3.4 Agendamento interno (recepção, no painel)</w:t>
       </w:r>
@@ -8032,7 +8032,7 @@
       <w:pPr>
         <w:pStyle w:val="Ttulo2"/>
       </w:pPr>
-      <w:bookmarkStart w:id="10" w:name="_Toc244286997"/>
+      <w:bookmarkStart w:id="10" w:name="_Toc244287875"/>
       <w:r>
         <w:t>3.5 Disponibilidade (SlotService)</w:t>
       </w:r>
@@ -8177,7 +8177,7 @@
       <w:pPr>
         <w:pStyle w:val="Ttulo2"/>
       </w:pPr>
-      <w:bookmarkStart w:id="11" w:name="_Toc244286998"/>
+      <w:bookmarkStart w:id="11" w:name="_Toc244287876"/>
       <w:r>
         <w:t>3.6 Máquina de estados do atendimento (FSM)</w:t>
       </w:r>
@@ -8640,7 +8640,7 @@
       <w:pPr>
         <w:pStyle w:val="Ttulo2"/>
       </w:pPr>
-      <w:bookmarkStart w:id="12" w:name="_Toc244286999"/>
+      <w:bookmarkStart w:id="12" w:name="_Toc244287877"/>
       <w:r>
         <w:t>3.7 Aprovação e rejeição</w:t>
       </w:r>
@@ -9192,7 +9192,7 @@
       <w:pPr>
         <w:pStyle w:val="Ttulo2"/>
       </w:pPr>
-      <w:bookmarkStart w:id="13" w:name="_Toc244287000"/>
+      <w:bookmarkStart w:id="13" w:name="_Toc244287878"/>
       <w:r>
         <w:t>3.8 Reagendamento e cancelamento</w:t>
       </w:r>
@@ -9575,7 +9575,7 @@
       <w:pPr>
         <w:pStyle w:val="Ttulo2"/>
       </w:pPr>
-      <w:bookmarkStart w:id="14" w:name="_Toc244287001"/>
+      <w:bookmarkStart w:id="14" w:name="_Toc244287879"/>
       <w:r>
         <w:t>3.9 Lembrete D-1 e confirmação de presença</w:t>
       </w:r>
@@ -9768,7 +9768,7 @@
       <w:pPr>
         <w:pStyle w:val="Ttulo2"/>
       </w:pPr>
-      <w:bookmarkStart w:id="15" w:name="_Toc244287002"/>
+      <w:bookmarkStart w:id="15" w:name="_Toc244287880"/>
       <w:r>
         <w:t>3.10 Faltas (no-show)</w:t>
       </w:r>
@@ -9864,7 +9864,7 @@
       <w:pPr>
         <w:pStyle w:val="Ttulo2"/>
       </w:pPr>
-      <w:bookmarkStart w:id="16" w:name="_Toc244287003"/>
+      <w:bookmarkStart w:id="16" w:name="_Toc244287881"/>
       <w:r>
         <w:t>3.11 Retorno obrigatório (F-RET)</w:t>
       </w:r>
@@ -10139,7 +10139,7 @@
       <w:pPr>
         <w:pStyle w:val="Ttulo2"/>
       </w:pPr>
-      <w:bookmarkStart w:id="17" w:name="_Toc244287004"/>
+      <w:bookmarkStart w:id="17" w:name="_Toc244287882"/>
       <w:r>
         <w:t>3.12 Pacotes</w:t>
       </w:r>
@@ -10530,7 +10530,7 @@
       <w:pPr>
         <w:pStyle w:val="Ttulo2"/>
       </w:pPr>
-      <w:bookmarkStart w:id="18" w:name="_Toc244287005"/>
+      <w:bookmarkStart w:id="18" w:name="_Toc244287883"/>
       <w:r>
         <w:t>3.13 Preços e promoções</w:t>
       </w:r>
@@ -10786,7 +10786,7 @@
       <w:pPr>
         <w:pStyle w:val="Ttulo2"/>
       </w:pPr>
-      <w:bookmarkStart w:id="19" w:name="_Toc244287006"/>
+      <w:bookmarkStart w:id="19" w:name="_Toc244287884"/>
       <w:r>
         <w:t>3.14 Valor cobrado e faturamento</w:t>
       </w:r>
@@ -11084,7 +11084,7 @@
       <w:pPr>
         <w:pStyle w:val="Ttulo2"/>
       </w:pPr>
-      <w:bookmarkStart w:id="20" w:name="_Toc244287007"/>
+      <w:bookmarkStart w:id="20" w:name="_Toc244287885"/>
       <w:r>
         <w:t>3.15 Comissão do profissional</w:t>
       </w:r>
@@ -11373,7 +11373,7 @@
       <w:pPr>
         <w:pStyle w:val="Ttulo2"/>
       </w:pPr>
-      <w:bookmarkStart w:id="21" w:name="_Toc244287008"/>
+      <w:bookmarkStart w:id="21" w:name="_Toc244287886"/>
       <w:r>
         <w:t>3.16 Cashback por indicação (F-CSB) e carteira</w:t>
       </w:r>
@@ -11600,7 +11600,7 @@
       <w:pPr>
         <w:pStyle w:val="Ttulo2"/>
       </w:pPr>
-      <w:bookmarkStart w:id="22" w:name="_Toc244287009"/>
+      <w:bookmarkStart w:id="22" w:name="_Toc244287887"/>
       <w:r>
         <w:t>3.17 Lista de espera</w:t>
       </w:r>
@@ -11925,7 +11925,7 @@
       <w:pPr>
         <w:pStyle w:val="Ttulo2"/>
       </w:pPr>
-      <w:bookmarkStart w:id="23" w:name="_Toc244287010"/>
+      <w:bookmarkStart w:id="23" w:name="_Toc244287888"/>
       <w:r>
         <w:t>3.18 NPS e depoimentos</w:t>
       </w:r>
@@ -12488,7 +12488,7 @@
       <w:pPr>
         <w:pStyle w:val="Ttulo2"/>
       </w:pPr>
-      <w:bookmarkStart w:id="24" w:name="_Toc244287011"/>
+      <w:bookmarkStart w:id="24" w:name="_Toc244287889"/>
       <w:r>
         <w:t>3.19 Aniversário e e-mails de promoção</w:t>
       </w:r>
@@ -12645,7 +12645,7 @@
       <w:pPr>
         <w:pStyle w:val="Ttulo2"/>
       </w:pPr>
-      <w:bookmarkStart w:id="25" w:name="_Toc244287012"/>
+      <w:bookmarkStart w:id="25" w:name="_Toc244287890"/>
       <w:r>
         <w:t>3.20 Ficha (prontuário), histórico, anotações, anamnese e alertas</w:t>
       </w:r>
@@ -13119,7 +13119,7 @@
       <w:pPr>
         <w:pStyle w:val="Ttulo2"/>
       </w:pPr>
-      <w:bookmarkStart w:id="26" w:name="_Toc244287013"/>
+      <w:bookmarkStart w:id="26" w:name="_Toc244287891"/>
       <w:r>
         <w:t>3.21 Termos e consentimentos (LGPD)</w:t>
       </w:r>
@@ -13669,7 +13669,7 @@
       <w:pPr>
         <w:pStyle w:val="Ttulo2"/>
       </w:pPr>
-      <w:bookmarkStart w:id="27" w:name="_Toc244287014"/>
+      <w:bookmarkStart w:id="27" w:name="_Toc244287892"/>
       <w:r>
         <w:t>3.22 Retenção e esquecimento</w:t>
       </w:r>
@@ -14549,7 +14549,7 @@
       <w:pPr>
         <w:pStyle w:val="Ttulo2"/>
       </w:pPr>
-      <w:bookmarkStart w:id="28" w:name="_Toc244287015"/>
+      <w:bookmarkStart w:id="28" w:name="_Toc244287893"/>
       <w:r>
         <w:t>3.23 Efeitos automáticos por transição</w:t>
       </w:r>
@@ -14888,7 +14888,7 @@
       <w:pPr>
         <w:pStyle w:val="Ttulo2"/>
       </w:pPr>
-      <w:bookmarkStart w:id="29" w:name="_Toc244287016"/>
+      <w:bookmarkStart w:id="29" w:name="_Toc244287894"/>
       <w:r>
         <w:t>3.24 Valores-chave</w:t>
       </w:r>
@@ -17165,7 +17165,7 @@
       <w:pPr>
         <w:pStyle w:val="Ttulo1"/>
       </w:pPr>
-      <w:bookmarkStart w:id="30" w:name="_Toc244287017"/>
+      <w:bookmarkStart w:id="30" w:name="_Toc244287895"/>
       <w:r>
         <w:t>4. Diagramas de apoio</w:t>
       </w:r>
@@ -17191,7 +17191,7 @@
           <w:noProof/>
         </w:rPr>
         <w:drawing>
-          <wp:inline distT="0" distB="0" distL="0" distR="0" wp14:anchorId="141F6475" wp14:editId="135DA7BC">
+          <wp:inline distT="0" distB="0" distL="0" distR="0" wp14:anchorId="02EE2C07" wp14:editId="061BAC23">
             <wp:extent cx="7772400" cy="4630161"/>
             <wp:effectExtent l="0" t="0" r="0" b="0"/>
             <wp:docPr id="1" name="Picture 1"/>
@@ -17254,7 +17254,7 @@
           <w:noProof/>
         </w:rPr>
         <w:drawing>
-          <wp:inline distT="0" distB="0" distL="0" distR="0" wp14:anchorId="0AF898DD" wp14:editId="7E0D0749">
+          <wp:inline distT="0" distB="0" distL="0" distR="0" wp14:anchorId="6EA778E8" wp14:editId="29D643F9">
             <wp:extent cx="7772400" cy="4159284"/>
             <wp:effectExtent l="0" t="0" r="0" b="0"/>
             <wp:docPr id="2" name="Picture 2"/>
@@ -17317,7 +17317,7 @@
           <w:noProof/>
         </w:rPr>
         <w:drawing>
-          <wp:inline distT="0" distB="0" distL="0" distR="0" wp14:anchorId="54DD73C7" wp14:editId="4EAF87A9">
+          <wp:inline distT="0" distB="0" distL="0" distR="0" wp14:anchorId="1BFA8126" wp14:editId="74395289">
             <wp:extent cx="7772400" cy="3905302"/>
             <wp:effectExtent l="0" t="0" r="0" b="0"/>
             <wp:docPr id="3" name="Picture 3"/>
@@ -17385,7 +17385,7 @@
           <w:noProof/>
         </w:rPr>
         <w:drawing>
-          <wp:inline distT="0" distB="0" distL="0" distR="0" wp14:anchorId="3EF44D97" wp14:editId="3D51629D">
+          <wp:inline distT="0" distB="0" distL="0" distR="0" wp14:anchorId="562059C3" wp14:editId="322081C1">
             <wp:extent cx="5486400" cy="6441815"/>
             <wp:effectExtent l="0" t="0" r="0" b="0"/>
             <wp:docPr id="4" name="Picture 4"/>
@@ -17443,7 +17443,7 @@
           <w:noProof/>
         </w:rPr>
         <w:drawing>
-          <wp:inline distT="0" distB="0" distL="0" distR="0" wp14:anchorId="7640E2D2" wp14:editId="324A7E90">
+          <wp:inline distT="0" distB="0" distL="0" distR="0" wp14:anchorId="241EA2E1" wp14:editId="465B5C71">
             <wp:extent cx="5486400" cy="7248088"/>
             <wp:effectExtent l="0" t="0" r="0" b="0"/>
             <wp:docPr id="5" name="Picture 5"/>
@@ -17501,7 +17501,7 @@
           <w:noProof/>
         </w:rPr>
         <w:drawing>
-          <wp:inline distT="0" distB="0" distL="0" distR="0" wp14:anchorId="6EE61FEB" wp14:editId="0D6370C3">
+          <wp:inline distT="0" distB="0" distL="0" distR="0" wp14:anchorId="39F63890" wp14:editId="35E4BA2A">
             <wp:extent cx="5486400" cy="6703888"/>
             <wp:effectExtent l="0" t="0" r="0" b="0"/>
             <wp:docPr id="6" name="Picture 6"/>
@@ -17559,7 +17559,7 @@
       <w:pPr>
         <w:pStyle w:val="Ttulo1"/>
       </w:pPr>
-      <w:bookmarkStart w:id="31" w:name="_Toc244287018"/>
+      <w:bookmarkStart w:id="31" w:name="_Toc244287896"/>
       <w:r>
         <w:t>5. Glossário</w:t>
       </w:r>
@@ -20244,31 +20244,31 @@
       </w:rPr>
     </w:lvl>
   </w:abstractNum>
-  <w:num w:numId="1" w16cid:durableId="363023470">
+  <w:num w:numId="1" w16cid:durableId="1937858656">
     <w:abstractNumId w:val="8"/>
   </w:num>
-  <w:num w:numId="2" w16cid:durableId="1307396018">
+  <w:num w:numId="2" w16cid:durableId="1662155082">
     <w:abstractNumId w:val="6"/>
   </w:num>
-  <w:num w:numId="3" w16cid:durableId="1936866833">
+  <w:num w:numId="3" w16cid:durableId="233902832">
     <w:abstractNumId w:val="5"/>
   </w:num>
-  <w:num w:numId="4" w16cid:durableId="954408539">
+  <w:num w:numId="4" w16cid:durableId="926311212">
     <w:abstractNumId w:val="4"/>
   </w:num>
-  <w:num w:numId="5" w16cid:durableId="1759249263">
+  <w:num w:numId="5" w16cid:durableId="2031294261">
     <w:abstractNumId w:val="7"/>
   </w:num>
-  <w:num w:numId="6" w16cid:durableId="1572958216">
+  <w:num w:numId="6" w16cid:durableId="528490680">
     <w:abstractNumId w:val="3"/>
   </w:num>
-  <w:num w:numId="7" w16cid:durableId="1542011686">
+  <w:num w:numId="7" w16cid:durableId="815294821">
     <w:abstractNumId w:val="2"/>
   </w:num>
-  <w:num w:numId="8" w16cid:durableId="986975561">
+  <w:num w:numId="8" w16cid:durableId="402919034">
     <w:abstractNumId w:val="1"/>
   </w:num>
-  <w:num w:numId="9" w16cid:durableId="354700260">
+  <w:num w:numId="9" w16cid:durableId="283005480">
     <w:abstractNumId w:val="0"/>
   </w:num>
 </w:numbering>
@@ -31666,7 +31666,7 @@
     <w:autoRedefine/>
     <w:uiPriority w:val="39"/>
     <w:unhideWhenUsed/>
-    <w:rsid w:val="000A6BE0"/>
+    <w:rsid w:val="00356624"/>
     <w:pPr>
       <w:spacing w:after="100"/>
     </w:pPr>
@@ -31678,7 +31678,7 @@
     <w:autoRedefine/>
     <w:uiPriority w:val="39"/>
     <w:unhideWhenUsed/>
-    <w:rsid w:val="000A6BE0"/>
+    <w:rsid w:val="00356624"/>
     <w:pPr>
       <w:spacing w:after="100"/>
       <w:ind w:left="210"/>
@@ -31689,7 +31689,7 @@
     <w:basedOn w:val="Fontepargpadro"/>
     <w:uiPriority w:val="99"/>
     <w:unhideWhenUsed/>
-    <w:rsid w:val="000A6BE0"/>
+    <w:rsid w:val="00356624"/>
     <w:rPr>
       <w:color w:val="0000FF" w:themeColor="hyperlink"/>
       <w:u w:val="single"/>

</xml_diff>